<commit_message>
Requisitos: se recupera RF-26 y se corrige la dependencia de RF-13
RF-26 estaba declarado como dependencia por RF-07, RF-09, RF-14 y RF-16,
pero no existia como ficha. La revision mostro ademas que el documento no
contenia ningun requisito de aislamiento de datos: ni entre los 25
requisitos funcionales ni entre los 23 no funcionales aparecia "aislar",
"cuenta autenticada" ni "no autorizado".

Se recupera el texto de la version anterior del modelo, donde era RF-20:
toda consulta o modificacion aplica exclusivamente a la cuenta
autenticada, y un usuario no puede acceder a recursos de otro ni
conociendo su identificador. Prioridad Must, requisito derivado.

RF-13 declaraba depender de si mismo. Segun su propio criterio, la rama
de estados por cobro necesita la deteccion de cobros: la dependencia
correcta es RF-14, no RF-13.

La seccion 9.4 ya no reporta referencias rotas.
</commit_message>
<xml_diff>
--- a/docs/Modelado de requisitos - Ojo al Gasto.docx
+++ b/docs/Modelado de requisitos - Ojo al Gasto.docx
@@ -14719,7 +14719,7 @@
           <w:sz w:val="20"/>
           <w:szCs w:val="20"/>
         </w:rPr>
-        <w:t xml:space="preserve">Los 25 requisitos que describen comportamientos observables del sistema. Cada ficha declara de dónde nace el requisito, su prioridad, de qué otros requisitos depende y cómo se comprueba que está cumplido.</w:t>
+        <w:t xml:space="preserve">Los 26 requisitos que describen comportamientos observables del sistema. Cada ficha declara de dónde nace el requisito, su prioridad, de qué otros requisitos depende y cómo se comprueba que está cumplido.</w:t>
       </w:r>
     </w:p>
     <w:p>
@@ -17621,7 +17621,7 @@
                 <w:sz w:val="18"/>
                 <w:szCs w:val="18"/>
               </w:rPr>
-              <w:t xml:space="preserve">RF-06, RF-13, RF-15</w:t>
+              <w:t xml:space="preserve">RF-06, RF-14, RF-15</w:t>
             </w:r>
           </w:p>
         </w:tc>
@@ -20454,6 +20454,258 @@
           <w:szCs w:val="20"/>
         </w:rPr>
         <w:t xml:space="preserve">Explicación cita montos, uso o presupuesto reales asociados a la recomendación.</w:t>
+      </w:r>
+    </w:p>
+    <w:p>
+      <w:pPr>
+        <w:pStyle w:val="Heading3"/>
+        <w:spacing w:after="100" w:before="260"/>
+      </w:pPr>
+      <w:r>
+        <w:rPr>
+          <w:b/>
+          <w:bCs/>
+          <w:color w:val="2E5395"/>
+          <w:sz w:val="21"/>
+          <w:szCs w:val="21"/>
+        </w:rPr>
+        <w:t xml:space="preserve">RF-26 · Aislar los datos por cuenta: toda consulta o modificación sobre suscripcion…</w:t>
+      </w:r>
+    </w:p>
+    <w:tbl>
+      <w:tblPr>
+        <w:tblW w:type="dxa" w:w="9360"/>
+        <w:tblBorders>
+          <w:top w:val="single" w:color="C7D3E2" w:sz="4"/>
+          <w:left w:val="single" w:color="C7D3E2" w:sz="4"/>
+          <w:bottom w:val="single" w:color="C7D3E2" w:sz="4"/>
+          <w:right w:val="single" w:color="C7D3E2" w:sz="4"/>
+          <w:insideH w:val="none" w:sz="0"/>
+          <w:insideV w:val="single" w:color="C7D3E2" w:sz="4"/>
+        </w:tblBorders>
+      </w:tblPr>
+      <w:tblGrid>
+        <w:gridCol w:w="2340"/>
+        <w:gridCol w:w="2340"/>
+        <w:gridCol w:w="2340"/>
+        <w:gridCol w:w="2340"/>
+      </w:tblGrid>
+      <w:tr>
+        <w:tc>
+          <w:tcPr>
+            <w:tcW w:type="dxa" w:w="2340"/>
+            <w:shd w:fill="F4F7FB" w:color="auto" w:val="clear"/>
+            <w:tcMar>
+              <w:top w:type="dxa" w:w="60"/>
+              <w:left w:type="dxa" w:w="110"/>
+              <w:bottom w:type="dxa" w:w="60"/>
+              <w:right w:type="dxa" w:w="110"/>
+            </w:tcMar>
+          </w:tcPr>
+          <w:p>
+            <w:pPr>
+              <w:spacing w:after="20"/>
+            </w:pPr>
+            <w:r>
+              <w:rPr>
+                <w:b/>
+                <w:bCs/>
+                <w:caps/>
+                <w:color w:val="5B6675"/>
+                <w:sz w:val="15"/>
+                <w:szCs w:val="15"/>
+              </w:rPr>
+              <w:t xml:space="preserve">Tipo</w:t>
+            </w:r>
+          </w:p>
+          <w:p>
+            <w:pPr>
+              <w:spacing w:after="0"/>
+            </w:pPr>
+            <w:r>
+              <w:rPr>
+                <w:sz w:val="18"/>
+                <w:szCs w:val="18"/>
+              </w:rPr>
+              <w:t xml:space="preserve">Funcional</w:t>
+            </w:r>
+          </w:p>
+        </w:tc>
+        <w:tc>
+          <w:tcPr>
+            <w:tcW w:type="dxa" w:w="2340"/>
+            <w:shd w:fill="F4F7FB" w:color="auto" w:val="clear"/>
+            <w:tcMar>
+              <w:top w:type="dxa" w:w="60"/>
+              <w:left w:type="dxa" w:w="110"/>
+              <w:bottom w:type="dxa" w:w="60"/>
+              <w:right w:type="dxa" w:w="110"/>
+            </w:tcMar>
+          </w:tcPr>
+          <w:p>
+            <w:pPr>
+              <w:spacing w:after="20"/>
+            </w:pPr>
+            <w:r>
+              <w:rPr>
+                <w:b/>
+                <w:bCs/>
+                <w:caps/>
+                <w:color w:val="5B6675"/>
+                <w:sz w:val="15"/>
+                <w:szCs w:val="15"/>
+              </w:rPr>
+              <w:t xml:space="preserve">Fuente</w:t>
+            </w:r>
+          </w:p>
+          <w:p>
+            <w:pPr>
+              <w:spacing w:after="0"/>
+            </w:pPr>
+            <w:r>
+              <w:rPr>
+                <w:sz w:val="18"/>
+                <w:szCs w:val="18"/>
+              </w:rPr>
+              <w:t xml:space="preserve">Derivado de RF-07, RF-09, RF-14 y RF-16; RN-SEG-001</w:t>
+            </w:r>
+          </w:p>
+        </w:tc>
+        <w:tc>
+          <w:tcPr>
+            <w:tcW w:type="dxa" w:w="2340"/>
+            <w:shd w:fill="F4F7FB" w:color="auto" w:val="clear"/>
+            <w:tcMar>
+              <w:top w:type="dxa" w:w="60"/>
+              <w:left w:type="dxa" w:w="110"/>
+              <w:bottom w:type="dxa" w:w="60"/>
+              <w:right w:type="dxa" w:w="110"/>
+            </w:tcMar>
+          </w:tcPr>
+          <w:p>
+            <w:pPr>
+              <w:spacing w:after="20"/>
+            </w:pPr>
+            <w:r>
+              <w:rPr>
+                <w:b/>
+                <w:bCs/>
+                <w:caps/>
+                <w:color w:val="5B6675"/>
+                <w:sz w:val="15"/>
+                <w:szCs w:val="15"/>
+              </w:rPr>
+              <w:t xml:space="preserve">Prioridad</w:t>
+            </w:r>
+          </w:p>
+          <w:p>
+            <w:pPr>
+              <w:spacing w:after="0"/>
+            </w:pPr>
+            <w:r>
+              <w:rPr>
+                <w:sz w:val="18"/>
+                <w:szCs w:val="18"/>
+              </w:rPr>
+              <w:t xml:space="preserve">Must</w:t>
+            </w:r>
+          </w:p>
+        </w:tc>
+        <w:tc>
+          <w:tcPr>
+            <w:tcW w:type="dxa" w:w="2340"/>
+            <w:shd w:fill="F4F7FB" w:color="auto" w:val="clear"/>
+            <w:tcMar>
+              <w:top w:type="dxa" w:w="60"/>
+              <w:left w:type="dxa" w:w="110"/>
+              <w:bottom w:type="dxa" w:w="60"/>
+              <w:right w:type="dxa" w:w="110"/>
+            </w:tcMar>
+          </w:tcPr>
+          <w:p>
+            <w:pPr>
+              <w:spacing w:after="20"/>
+            </w:pPr>
+            <w:r>
+              <w:rPr>
+                <w:b/>
+                <w:bCs/>
+                <w:caps/>
+                <w:color w:val="5B6675"/>
+                <w:sz w:val="15"/>
+                <w:szCs w:val="15"/>
+              </w:rPr>
+              <w:t xml:space="preserve">Dependencias</w:t>
+            </w:r>
+          </w:p>
+          <w:p>
+            <w:pPr>
+              <w:spacing w:after="0"/>
+            </w:pPr>
+            <w:r>
+              <w:rPr>
+                <w:sz w:val="18"/>
+                <w:szCs w:val="18"/>
+              </w:rPr>
+              <w:t xml:space="preserve">RF-02</w:t>
+            </w:r>
+          </w:p>
+        </w:tc>
+      </w:tr>
+    </w:tbl>
+    <w:p>
+      <w:pPr>
+        <w:spacing w:after="140"/>
+      </w:pPr>
+    </w:p>
+    <w:p>
+      <w:pPr>
+        <w:spacing w:after="110" w:line="290"/>
+        <w:ind w:left="280"/>
+        <w:jc w:val="both"/>
+      </w:pPr>
+      <w:r>
+        <w:rPr>
+          <w:b/>
+          <w:bCs/>
+          <w:caps/>
+          <w:color w:val="5B6675"/>
+          <w:sz w:val="18"/>
+          <w:szCs w:val="18"/>
+        </w:rPr>
+        <w:t xml:space="preserve">Requisito  </w:t>
+      </w:r>
+      <w:r>
+        <w:rPr>
+          <w:sz w:val="20"/>
+          <w:szCs w:val="20"/>
+        </w:rPr>
+        <w:t xml:space="preserve">Aislar los datos por cuenta: toda consulta o modificación sobre suscripciones, cobros, registros de uso, alertas, recomendaciones y conversaciones del asistente aplica exclusivamente a la cuenta autenticada. Un usuario no puede acceder a recursos de otro, ni siquiera conociendo su identificador.</w:t>
+      </w:r>
+    </w:p>
+    <w:p>
+      <w:pPr>
+        <w:spacing w:after="110" w:line="290"/>
+        <w:ind w:left="280"/>
+        <w:jc w:val="both"/>
+      </w:pPr>
+      <w:r>
+        <w:rPr>
+          <w:b/>
+          <w:bCs/>
+          <w:caps/>
+          <w:color w:val="5B6675"/>
+          <w:sz w:val="18"/>
+          <w:szCs w:val="18"/>
+        </w:rPr>
+        <w:t xml:space="preserve">Criterio de aceptación  </w:t>
+      </w:r>
+      <w:r>
+        <w:rPr>
+          <w:sz w:val="20"/>
+          <w:szCs w:val="20"/>
+        </w:rPr>
+        <w:t xml:space="preserve">Dado el identificador de un recurso perteneciente a otra cuenta, cuando el usuario autenticado lo solicita, entonces el sistema responde «no autorizado» o «no existe», sin revelar si el recurso existe. Al listar cualquier recurso, el usuario obtiene únicamente los propios.</w:t>
       </w:r>
     </w:p>
     <w:p>
@@ -36391,7 +36643,7 @@
                 <w:sz w:val="16"/>
                 <w:szCs w:val="16"/>
               </w:rPr>
-              <w:t xml:space="preserve">RF-06, RF-13, RF-15</w:t>
+              <w:t xml:space="preserve">RF-06, RF-14, RF-15</w:t>
             </w:r>
           </w:p>
         </w:tc>
@@ -38012,6 +38264,141 @@
                 <w:szCs w:val="16"/>
               </w:rPr>
               <w:t xml:space="preserve">RF-24</w:t>
+            </w:r>
+          </w:p>
+        </w:tc>
+      </w:tr>
+      <w:tr>
+        <w:trPr>
+          <w:tblHeader w:val="false"/>
+        </w:trPr>
+        <w:tc>
+          <w:tcPr>
+            <w:tcW w:type="dxa" w:w="780"/>
+            <w:shd w:fill="FFFFFF" w:color="auto" w:val="clear"/>
+            <w:tcMar>
+              <w:top w:type="dxa" w:w="60"/>
+              <w:left w:type="dxa" w:w="90"/>
+              <w:bottom w:type="dxa" w:w="60"/>
+              <w:right w:type="dxa" w:w="90"/>
+            </w:tcMar>
+          </w:tcPr>
+          <w:p>
+            <w:pPr>
+              <w:spacing w:after="0" w:line="250"/>
+            </w:pPr>
+            <w:r>
+              <w:rPr>
+                <w:b w:val="false"/>
+                <w:bCs w:val="false"/>
+                <w:sz w:val="16"/>
+                <w:szCs w:val="16"/>
+              </w:rPr>
+              <w:t xml:space="preserve">RF-26</w:t>
+            </w:r>
+          </w:p>
+        </w:tc>
+        <w:tc>
+          <w:tcPr>
+            <w:tcW w:type="dxa" w:w="3600"/>
+            <w:shd w:fill="FFFFFF" w:color="auto" w:val="clear"/>
+            <w:tcMar>
+              <w:top w:type="dxa" w:w="60"/>
+              <w:left w:type="dxa" w:w="90"/>
+              <w:bottom w:type="dxa" w:w="60"/>
+              <w:right w:type="dxa" w:w="90"/>
+            </w:tcMar>
+          </w:tcPr>
+          <w:p>
+            <w:pPr>
+              <w:spacing w:after="0" w:line="250"/>
+            </w:pPr>
+            <w:r>
+              <w:rPr>
+                <w:b w:val="false"/>
+                <w:bCs w:val="false"/>
+                <w:sz w:val="16"/>
+                <w:szCs w:val="16"/>
+              </w:rPr>
+              <w:t xml:space="preserve">Aislar los datos por cuenta: toda consulta o modificación so…</w:t>
+            </w:r>
+          </w:p>
+        </w:tc>
+        <w:tc>
+          <w:tcPr>
+            <w:tcW w:type="dxa" w:w="2100"/>
+            <w:shd w:fill="FFFFFF" w:color="auto" w:val="clear"/>
+            <w:tcMar>
+              <w:top w:type="dxa" w:w="60"/>
+              <w:left w:type="dxa" w:w="90"/>
+              <w:bottom w:type="dxa" w:w="60"/>
+              <w:right w:type="dxa" w:w="90"/>
+            </w:tcMar>
+          </w:tcPr>
+          <w:p>
+            <w:pPr>
+              <w:spacing w:after="0" w:line="250"/>
+            </w:pPr>
+            <w:r>
+              <w:rPr>
+                <w:b w:val="false"/>
+                <w:bCs w:val="false"/>
+                <w:sz w:val="16"/>
+                <w:szCs w:val="16"/>
+              </w:rPr>
+              <w:t xml:space="preserve">Derivado de RF-07, RF-09, RF-14 y RF-16; RN-SEG-001</w:t>
+            </w:r>
+          </w:p>
+        </w:tc>
+        <w:tc>
+          <w:tcPr>
+            <w:tcW w:type="dxa" w:w="900"/>
+            <w:shd w:fill="FFFFFF" w:color="auto" w:val="clear"/>
+            <w:tcMar>
+              <w:top w:type="dxa" w:w="60"/>
+              <w:left w:type="dxa" w:w="90"/>
+              <w:bottom w:type="dxa" w:w="60"/>
+              <w:right w:type="dxa" w:w="90"/>
+            </w:tcMar>
+          </w:tcPr>
+          <w:p>
+            <w:pPr>
+              <w:spacing w:after="0" w:line="250"/>
+            </w:pPr>
+            <w:r>
+              <w:rPr>
+                <w:b w:val="false"/>
+                <w:bCs w:val="false"/>
+                <w:sz w:val="16"/>
+                <w:szCs w:val="16"/>
+              </w:rPr>
+              <w:t xml:space="preserve">Must</w:t>
+            </w:r>
+          </w:p>
+        </w:tc>
+        <w:tc>
+          <w:tcPr>
+            <w:tcW w:type="dxa" w:w="1980"/>
+            <w:shd w:fill="FFFFFF" w:color="auto" w:val="clear"/>
+            <w:tcMar>
+              <w:top w:type="dxa" w:w="60"/>
+              <w:left w:type="dxa" w:w="90"/>
+              <w:bottom w:type="dxa" w:w="60"/>
+              <w:right w:type="dxa" w:w="90"/>
+            </w:tcMar>
+          </w:tcPr>
+          <w:p>
+            <w:pPr>
+              <w:spacing w:after="0" w:line="250"/>
+            </w:pPr>
+            <w:r>
+              <w:rPr>
+                <w:b w:val="false"/>
+                <w:bCs w:val="false"/>
+                <w:sz w:val="16"/>
+                <w:szCs w:val="16"/>
+              </w:rPr>
+              <w:t xml:space="preserve">RF-02</w:t>
             </w:r>
           </w:p>
         </w:tc>
@@ -41706,7 +42093,7 @@
                 <w:sz w:val="16"/>
                 <w:szCs w:val="16"/>
               </w:rPr>
-              <w:t xml:space="preserve">25</w:t>
+              <w:t xml:space="preserve">26</w:t>
             </w:r>
           </w:p>
         </w:tc>
@@ -41919,39 +42306,14 @@
           <w:sz w:val="18"/>
           <w:szCs w:val="18"/>
         </w:rPr>
-        <w:t xml:space="preserve">Referencias rotas  </w:t>
+        <w:t xml:space="preserve">Referencias  </w:t>
       </w:r>
       <w:r>
         <w:rPr>
           <w:sz w:val="20"/>
           <w:szCs w:val="20"/>
         </w:rPr>
-        <w:t xml:space="preserve">RF-26 aparece como dependencia de otros requisitos, pero no existe como ficha propia en la sección 4. O se escribe el requisito, o se corrige la dependencia.</w:t>
-      </w:r>
-    </w:p>
-    <w:p>
-      <w:pPr>
-        <w:spacing w:after="110" w:line="290"/>
-        <w:ind w:left="280"/>
-        <w:jc w:val="both"/>
-      </w:pPr>
-      <w:r>
-        <w:rPr>
-          <w:b/>
-          <w:bCs/>
-          <w:caps/>
-          <w:color w:val="5B6675"/>
-          <w:sz w:val="18"/>
-          <w:szCs w:val="18"/>
-        </w:rPr>
-        <w:t xml:space="preserve">Autodependencia  </w:t>
-      </w:r>
-      <w:r>
-        <w:rPr>
-          <w:sz w:val="20"/>
-          <w:szCs w:val="20"/>
-        </w:rPr>
-        <w:t xml:space="preserve">RF-13 se declara dependiente de sí mismo. Debe revisarse cuál era la dependencia real.</w:t>
+        <w:t xml:space="preserve">Todas las dependencias declaradas apuntan a requisitos que existen en la seccion 6. No hay referencias rotas ni autodependencias.</w:t>
       </w:r>
     </w:p>
     <w:p>

</xml_diff>

<commit_message>
Se corrigen las referencias rotas por el cambio de numeracion
Tres problemas, uno de ellos serio.

- Los cinco diagramas de casos de uso NO estaban en el documento. La ruta
  se resolvia relativa a una carpeta temporal y quedaba fuera del proyecto,
  y el generador saltaba la figura en silencio con un existsSync. Ahora la
  ruta es absoluta y la ausencia de una figura lanza error en vez de
  pasar desapercibida. Las diez figuras estan y quedan correlativas.

- En la tabla de alineacion con SWEBOK, la fila 4.4 apuntaba a la seccion
  10 cuando el modelado UML paso a ser la 11.

- La fila 4.3 de esa misma tabla habia quedado duplicada.

El documento pasa de 51 a 56 paginas.
</commit_message>
<xml_diff>
--- a/docs/Modelado de requisitos - Ojo al Gasto.docx
+++ b/docs/Modelado de requisitos - Ojo al Gasto.docx
@@ -1528,7 +1528,7 @@
                 <w:sz w:val="16"/>
                 <w:szCs w:val="16"/>
               </w:rPr>
-              <w:t xml:space="preserve">Formato Dado / Cuando / Entonces</w:t>
+              <w:t xml:space="preserve">Fichas de las secciones 5 a 7; pruebas en la 10</w:t>
             </w:r>
           </w:p>
         </w:tc>
@@ -1611,7 +1611,7 @@
                 <w:sz w:val="16"/>
                 <w:szCs w:val="16"/>
               </w:rPr>
-              <w:t xml:space="preserve">Sección 10</w:t>
+              <w:t xml:space="preserve">Sección 11</w:t>
             </w:r>
           </w:p>
         </w:tc>
@@ -1778,89 +1778,6 @@
                 <w:szCs w:val="16"/>
               </w:rPr>
               <w:t xml:space="preserve">Este documento es comprensivo</w:t>
-            </w:r>
-          </w:p>
-        </w:tc>
-        <w:tc>
-          <w:tcPr>
-            <w:tcW w:type="dxa" w:w="1960"/>
-            <w:shd w:fill="FFFFFF" w:color="auto" w:val="clear"/>
-            <w:tcMar>
-              <w:top w:type="dxa" w:w="60"/>
-              <w:left w:type="dxa" w:w="90"/>
-              <w:bottom w:type="dxa" w:w="60"/>
-              <w:right w:type="dxa" w:w="90"/>
-            </w:tcMar>
-          </w:tcPr>
-          <w:p>
-            <w:pPr>
-              <w:spacing w:after="0" w:line="250"/>
-            </w:pPr>
-            <w:r>
-              <w:rPr>
-                <w:b w:val="false"/>
-                <w:bCs w:val="false"/>
-                <w:sz w:val="16"/>
-                <w:szCs w:val="16"/>
-              </w:rPr>
-              <w:t xml:space="preserve">Cubierto</w:t>
-            </w:r>
-          </w:p>
-        </w:tc>
-      </w:tr>
-      <w:tr>
-        <w:trPr>
-          <w:tblHeader w:val="false"/>
-        </w:trPr>
-        <w:tc>
-          <w:tcPr>
-            <w:tcW w:type="dxa" w:w="3600"/>
-            <w:shd w:fill="FFFFFF" w:color="auto" w:val="clear"/>
-            <w:tcMar>
-              <w:top w:type="dxa" w:w="60"/>
-              <w:left w:type="dxa" w:w="90"/>
-              <w:bottom w:type="dxa" w:w="60"/>
-              <w:right w:type="dxa" w:w="90"/>
-            </w:tcMar>
-          </w:tcPr>
-          <w:p>
-            <w:pPr>
-              <w:spacing w:after="0" w:line="250"/>
-            </w:pPr>
-            <w:r>
-              <w:rPr>
-                <w:b w:val="false"/>
-                <w:bCs w:val="false"/>
-                <w:sz w:val="16"/>
-                <w:szCs w:val="16"/>
-              </w:rPr>
-              <w:t xml:space="preserve">4.3 Especificación basada en criterios de aceptación</w:t>
-            </w:r>
-          </w:p>
-        </w:tc>
-        <w:tc>
-          <w:tcPr>
-            <w:tcW w:type="dxa" w:w="3800"/>
-            <w:shd w:fill="FFFFFF" w:color="auto" w:val="clear"/>
-            <w:tcMar>
-              <w:top w:type="dxa" w:w="60"/>
-              <w:left w:type="dxa" w:w="90"/>
-              <w:bottom w:type="dxa" w:w="60"/>
-              <w:right w:type="dxa" w:w="90"/>
-            </w:tcMar>
-          </w:tcPr>
-          <w:p>
-            <w:pPr>
-              <w:spacing w:after="0" w:line="250"/>
-            </w:pPr>
-            <w:r>
-              <w:rPr>
-                <w:b w:val="false"/>
-                <w:bCs w:val="false"/>
-                <w:sz w:val="16"/>
-                <w:szCs w:val="16"/>
-              </w:rPr>
-              <w:t xml:space="preserve">Sección 10</w:t>
             </w:r>
           </w:p>
         </w:tc>
@@ -53853,7 +53770,7 @@
           <w:sz w:val="25"/>
           <w:szCs w:val="25"/>
         </w:rPr>
-        <w:t xml:space="preserve">11.2 Modelo entidad-relación</w:t>
+        <w:t xml:space="preserve">11.1 Casos de uso</w:t>
       </w:r>
     </w:p>
     <w:p>
@@ -53864,7 +53781,7 @@
       <w:r>
         <w:drawing>
           <wp:inline distT="0" distB="0" distL="0" distR="0">
-            <wp:extent cx="4238625" cy="7239000"/>
+            <wp:extent cx="5943600" cy="5848350"/>
             <wp:effectExtent t="0" r="0" b="0" l="0"/>
             <wp:docPr id="1" name="" descr="" title=""/>
             <wp:cNvGraphicFramePr>
@@ -53889,7 +53806,7 @@
                   <pic:spPr bwMode="auto">
                     <a:xfrm>
                       <a:off x="0" y="0"/>
-                      <a:ext cx="4238625" cy="7239000"/>
+                      <a:ext cx="5943600" cy="5848350"/>
                     </a:xfrm>
                     <a:prstGeom prst="rect">
                       <a:avLst/>
@@ -53915,23 +53832,7 @@
           <w:sz w:val="17"/>
           <w:szCs w:val="17"/>
         </w:rPr>
-        <w:t xml:space="preserve">Figura 6. Modelo entidad-relación.</w:t>
-      </w:r>
-    </w:p>
-    <w:p>
-      <w:pPr>
-        <w:pStyle w:val="Heading2"/>
-        <w:spacing w:after="150" w:before="300"/>
-      </w:pPr>
-      <w:r>
-        <w:rPr>
-          <w:b/>
-          <w:bCs/>
-          <w:color w:val="1F3864"/>
-          <w:sz w:val="25"/>
-          <w:szCs w:val="25"/>
-        </w:rPr>
-        <w:t xml:space="preserve">11.3 Diagrama de flujo</w:t>
+        <w:t xml:space="preserve">Figura 1. Casos de uso - cuenta y seguridad.</w:t>
       </w:r>
     </w:p>
     <w:p>
@@ -53942,7 +53843,7 @@
       <w:r>
         <w:drawing>
           <wp:inline distT="0" distB="0" distL="0" distR="0">
-            <wp:extent cx="2724150" cy="7239000"/>
+            <wp:extent cx="3390900" cy="7239000"/>
             <wp:effectExtent t="0" r="0" b="0" l="0"/>
             <wp:docPr id="1" name="" descr="" title=""/>
             <wp:cNvGraphicFramePr>
@@ -53967,7 +53868,7 @@
                   <pic:spPr bwMode="auto">
                     <a:xfrm>
                       <a:off x="0" y="0"/>
-                      <a:ext cx="2724150" cy="7239000"/>
+                      <a:ext cx="3390900" cy="7239000"/>
                     </a:xfrm>
                     <a:prstGeom prst="rect">
                       <a:avLst/>
@@ -53993,23 +53894,7 @@
           <w:sz w:val="17"/>
           <w:szCs w:val="17"/>
         </w:rPr>
-        <w:t xml:space="preserve">Figura 7. Diagrama de flujo.</w:t>
-      </w:r>
-    </w:p>
-    <w:p>
-      <w:pPr>
-        <w:pStyle w:val="Heading2"/>
-        <w:spacing w:after="150" w:before="300"/>
-      </w:pPr>
-      <w:r>
-        <w:rPr>
-          <w:b/>
-          <w:bCs/>
-          <w:color w:val="1F3864"/>
-          <w:sz w:val="25"/>
-          <w:szCs w:val="25"/>
-        </w:rPr>
-        <w:t xml:space="preserve">11.4 Arquitectura de software</w:t>
+        <w:t xml:space="preserve">Figura 2. Casos de uso - suscripciones y uso.</w:t>
       </w:r>
     </w:p>
     <w:p>
@@ -54020,7 +53905,7 @@
       <w:r>
         <w:drawing>
           <wp:inline distT="0" distB="0" distL="0" distR="0">
-            <wp:extent cx="5943600" cy="5438775"/>
+            <wp:extent cx="3724275" cy="7239000"/>
             <wp:effectExtent t="0" r="0" b="0" l="0"/>
             <wp:docPr id="1" name="" descr="" title=""/>
             <wp:cNvGraphicFramePr>
@@ -54045,7 +53930,7 @@
                   <pic:spPr bwMode="auto">
                     <a:xfrm>
                       <a:off x="0" y="0"/>
-                      <a:ext cx="5943600" cy="5438775"/>
+                      <a:ext cx="3724275" cy="7239000"/>
                     </a:xfrm>
                     <a:prstGeom prst="rect">
                       <a:avLst/>
@@ -54071,23 +53956,7 @@
           <w:sz w:val="17"/>
           <w:szCs w:val="17"/>
         </w:rPr>
-        <w:t xml:space="preserve">Figura 8. Arquitectura de software.</w:t>
-      </w:r>
-    </w:p>
-    <w:p>
-      <w:pPr>
-        <w:pStyle w:val="Heading2"/>
-        <w:spacing w:after="150" w:before="300"/>
-      </w:pPr>
-      <w:r>
-        <w:rPr>
-          <w:b/>
-          <w:bCs/>
-          <w:color w:val="1F3864"/>
-          <w:sz w:val="25"/>
-          <w:szCs w:val="25"/>
-        </w:rPr>
-        <w:t xml:space="preserve">11.5 Secuencia · detección y registro</w:t>
+        <w:t xml:space="preserve">Figura 3. Casos de uso - datos, panel y alertas.</w:t>
       </w:r>
     </w:p>
     <w:p>
@@ -54098,7 +53967,7 @@
       <w:r>
         <w:drawing>
           <wp:inline distT="0" distB="0" distL="0" distR="0">
-            <wp:extent cx="2771775" cy="7239000"/>
+            <wp:extent cx="5943600" cy="4676775"/>
             <wp:effectExtent t="0" r="0" b="0" l="0"/>
             <wp:docPr id="1" name="" descr="" title=""/>
             <wp:cNvGraphicFramePr>
@@ -54123,6 +53992,380 @@
                   <pic:spPr bwMode="auto">
                     <a:xfrm>
                       <a:off x="0" y="0"/>
+                      <a:ext cx="5943600" cy="4676775"/>
+                    </a:xfrm>
+                    <a:prstGeom prst="rect">
+                      <a:avLst/>
+                    </a:prstGeom>
+                  </pic:spPr>
+                </pic:pic>
+              </a:graphicData>
+            </a:graphic>
+          </wp:inline>
+        </w:drawing>
+      </w:r>
+    </w:p>
+    <w:p>
+      <w:pPr>
+        <w:spacing w:after="240"/>
+        <w:jc w:val="center"/>
+      </w:pPr>
+      <w:r>
+        <w:rPr>
+          <w:i/>
+          <w:iCs/>
+          <w:color w:val="5B6675"/>
+          <w:sz w:val="17"/>
+          <w:szCs w:val="17"/>
+        </w:rPr>
+        <w:t xml:space="preserve">Figura 4. Casos de uso - plan Premium y asistente.</w:t>
+      </w:r>
+    </w:p>
+    <w:p>
+      <w:pPr>
+        <w:spacing w:after="90" w:before="200"/>
+        <w:jc w:val="center"/>
+      </w:pPr>
+      <w:r>
+        <w:drawing>
+          <wp:inline distT="0" distB="0" distL="0" distR="0">
+            <wp:extent cx="4333875" cy="7239000"/>
+            <wp:effectExtent t="0" r="0" b="0" l="0"/>
+            <wp:docPr id="1" name="" descr="" title=""/>
+            <wp:cNvGraphicFramePr>
+              <a:graphicFrameLocks xmlns:a="http://schemas.openxmlformats.org/drawingml/2006/main" noChangeAspect="1"/>
+            </wp:cNvGraphicFramePr>
+            <a:graphic xmlns:a="http://schemas.openxmlformats.org/drawingml/2006/main">
+              <a:graphicData uri="http://schemas.openxmlformats.org/drawingml/2006/picture">
+                <pic:pic xmlns:pic="http://schemas.openxmlformats.org/drawingml/2006/picture">
+                  <pic:nvPicPr>
+                    <pic:cNvPr id="0" name="" descr=""/>
+                    <pic:cNvPicPr>
+                      <a:picLocks noChangeAspect="1" noChangeArrowheads="1"/>
+                    </pic:cNvPicPr>
+                  </pic:nvPicPr>
+                  <pic:blipFill>
+                    <a:blip r:embed="rId12" cstate="none"/>
+                    <a:srcRect/>
+                    <a:stretch>
+                      <a:fillRect/>
+                    </a:stretch>
+                  </pic:blipFill>
+                  <pic:spPr bwMode="auto">
+                    <a:xfrm>
+                      <a:off x="0" y="0"/>
+                      <a:ext cx="4333875" cy="7239000"/>
+                    </a:xfrm>
+                    <a:prstGeom prst="rect">
+                      <a:avLst/>
+                    </a:prstGeom>
+                  </pic:spPr>
+                </pic:pic>
+              </a:graphicData>
+            </a:graphic>
+          </wp:inline>
+        </w:drawing>
+      </w:r>
+    </w:p>
+    <w:p>
+      <w:pPr>
+        <w:spacing w:after="240"/>
+        <w:jc w:val="center"/>
+      </w:pPr>
+      <w:r>
+        <w:rPr>
+          <w:i/>
+          <w:iCs/>
+          <w:color w:val="5B6675"/>
+          <w:sz w:val="17"/>
+          <w:szCs w:val="17"/>
+        </w:rPr>
+        <w:t xml:space="preserve">Figura 5. Casos de uso - procesos automaticos.</w:t>
+      </w:r>
+    </w:p>
+    <w:p>
+      <w:pPr>
+        <w:pStyle w:val="Heading2"/>
+        <w:spacing w:after="150" w:before="300"/>
+      </w:pPr>
+      <w:r>
+        <w:rPr>
+          <w:b/>
+          <w:bCs/>
+          <w:color w:val="1F3864"/>
+          <w:sz w:val="25"/>
+          <w:szCs w:val="25"/>
+        </w:rPr>
+        <w:t xml:space="preserve">11.2 Modelo entidad-relación</w:t>
+      </w:r>
+    </w:p>
+    <w:p>
+      <w:pPr>
+        <w:spacing w:after="90" w:before="200"/>
+        <w:jc w:val="center"/>
+      </w:pPr>
+      <w:r>
+        <w:drawing>
+          <wp:inline distT="0" distB="0" distL="0" distR="0">
+            <wp:extent cx="4238625" cy="7239000"/>
+            <wp:effectExtent t="0" r="0" b="0" l="0"/>
+            <wp:docPr id="1" name="" descr="" title=""/>
+            <wp:cNvGraphicFramePr>
+              <a:graphicFrameLocks xmlns:a="http://schemas.openxmlformats.org/drawingml/2006/main" noChangeAspect="1"/>
+            </wp:cNvGraphicFramePr>
+            <a:graphic xmlns:a="http://schemas.openxmlformats.org/drawingml/2006/main">
+              <a:graphicData uri="http://schemas.openxmlformats.org/drawingml/2006/picture">
+                <pic:pic xmlns:pic="http://schemas.openxmlformats.org/drawingml/2006/picture">
+                  <pic:nvPicPr>
+                    <pic:cNvPr id="0" name="" descr=""/>
+                    <pic:cNvPicPr>
+                      <a:picLocks noChangeAspect="1" noChangeArrowheads="1"/>
+                    </pic:cNvPicPr>
+                  </pic:nvPicPr>
+                  <pic:blipFill>
+                    <a:blip r:embed="rId13" cstate="none"/>
+                    <a:srcRect/>
+                    <a:stretch>
+                      <a:fillRect/>
+                    </a:stretch>
+                  </pic:blipFill>
+                  <pic:spPr bwMode="auto">
+                    <a:xfrm>
+                      <a:off x="0" y="0"/>
+                      <a:ext cx="4238625" cy="7239000"/>
+                    </a:xfrm>
+                    <a:prstGeom prst="rect">
+                      <a:avLst/>
+                    </a:prstGeom>
+                  </pic:spPr>
+                </pic:pic>
+              </a:graphicData>
+            </a:graphic>
+          </wp:inline>
+        </w:drawing>
+      </w:r>
+    </w:p>
+    <w:p>
+      <w:pPr>
+        <w:spacing w:after="240"/>
+        <w:jc w:val="center"/>
+      </w:pPr>
+      <w:r>
+        <w:rPr>
+          <w:i/>
+          <w:iCs/>
+          <w:color w:val="5B6675"/>
+          <w:sz w:val="17"/>
+          <w:szCs w:val="17"/>
+        </w:rPr>
+        <w:t xml:space="preserve">Figura 6. Modelo entidad-relación.</w:t>
+      </w:r>
+    </w:p>
+    <w:p>
+      <w:pPr>
+        <w:pStyle w:val="Heading2"/>
+        <w:spacing w:after="150" w:before="300"/>
+      </w:pPr>
+      <w:r>
+        <w:rPr>
+          <w:b/>
+          <w:bCs/>
+          <w:color w:val="1F3864"/>
+          <w:sz w:val="25"/>
+          <w:szCs w:val="25"/>
+        </w:rPr>
+        <w:t xml:space="preserve">11.3 Diagrama de flujo</w:t>
+      </w:r>
+    </w:p>
+    <w:p>
+      <w:pPr>
+        <w:spacing w:after="90" w:before="200"/>
+        <w:jc w:val="center"/>
+      </w:pPr>
+      <w:r>
+        <w:drawing>
+          <wp:inline distT="0" distB="0" distL="0" distR="0">
+            <wp:extent cx="2724150" cy="7239000"/>
+            <wp:effectExtent t="0" r="0" b="0" l="0"/>
+            <wp:docPr id="1" name="" descr="" title=""/>
+            <wp:cNvGraphicFramePr>
+              <a:graphicFrameLocks xmlns:a="http://schemas.openxmlformats.org/drawingml/2006/main" noChangeAspect="1"/>
+            </wp:cNvGraphicFramePr>
+            <a:graphic xmlns:a="http://schemas.openxmlformats.org/drawingml/2006/main">
+              <a:graphicData uri="http://schemas.openxmlformats.org/drawingml/2006/picture">
+                <pic:pic xmlns:pic="http://schemas.openxmlformats.org/drawingml/2006/picture">
+                  <pic:nvPicPr>
+                    <pic:cNvPr id="0" name="" descr=""/>
+                    <pic:cNvPicPr>
+                      <a:picLocks noChangeAspect="1" noChangeArrowheads="1"/>
+                    </pic:cNvPicPr>
+                  </pic:nvPicPr>
+                  <pic:blipFill>
+                    <a:blip r:embed="rId14" cstate="none"/>
+                    <a:srcRect/>
+                    <a:stretch>
+                      <a:fillRect/>
+                    </a:stretch>
+                  </pic:blipFill>
+                  <pic:spPr bwMode="auto">
+                    <a:xfrm>
+                      <a:off x="0" y="0"/>
+                      <a:ext cx="2724150" cy="7239000"/>
+                    </a:xfrm>
+                    <a:prstGeom prst="rect">
+                      <a:avLst/>
+                    </a:prstGeom>
+                  </pic:spPr>
+                </pic:pic>
+              </a:graphicData>
+            </a:graphic>
+          </wp:inline>
+        </w:drawing>
+      </w:r>
+    </w:p>
+    <w:p>
+      <w:pPr>
+        <w:spacing w:after="240"/>
+        <w:jc w:val="center"/>
+      </w:pPr>
+      <w:r>
+        <w:rPr>
+          <w:i/>
+          <w:iCs/>
+          <w:color w:val="5B6675"/>
+          <w:sz w:val="17"/>
+          <w:szCs w:val="17"/>
+        </w:rPr>
+        <w:t xml:space="preserve">Figura 7. Diagrama de flujo.</w:t>
+      </w:r>
+    </w:p>
+    <w:p>
+      <w:pPr>
+        <w:pStyle w:val="Heading2"/>
+        <w:spacing w:after="150" w:before="300"/>
+      </w:pPr>
+      <w:r>
+        <w:rPr>
+          <w:b/>
+          <w:bCs/>
+          <w:color w:val="1F3864"/>
+          <w:sz w:val="25"/>
+          <w:szCs w:val="25"/>
+        </w:rPr>
+        <w:t xml:space="preserve">11.4 Arquitectura de software</w:t>
+      </w:r>
+    </w:p>
+    <w:p>
+      <w:pPr>
+        <w:spacing w:after="90" w:before="200"/>
+        <w:jc w:val="center"/>
+      </w:pPr>
+      <w:r>
+        <w:drawing>
+          <wp:inline distT="0" distB="0" distL="0" distR="0">
+            <wp:extent cx="5943600" cy="5438775"/>
+            <wp:effectExtent t="0" r="0" b="0" l="0"/>
+            <wp:docPr id="1" name="" descr="" title=""/>
+            <wp:cNvGraphicFramePr>
+              <a:graphicFrameLocks xmlns:a="http://schemas.openxmlformats.org/drawingml/2006/main" noChangeAspect="1"/>
+            </wp:cNvGraphicFramePr>
+            <a:graphic xmlns:a="http://schemas.openxmlformats.org/drawingml/2006/main">
+              <a:graphicData uri="http://schemas.openxmlformats.org/drawingml/2006/picture">
+                <pic:pic xmlns:pic="http://schemas.openxmlformats.org/drawingml/2006/picture">
+                  <pic:nvPicPr>
+                    <pic:cNvPr id="0" name="" descr=""/>
+                    <pic:cNvPicPr>
+                      <a:picLocks noChangeAspect="1" noChangeArrowheads="1"/>
+                    </pic:cNvPicPr>
+                  </pic:nvPicPr>
+                  <pic:blipFill>
+                    <a:blip r:embed="rId15" cstate="none"/>
+                    <a:srcRect/>
+                    <a:stretch>
+                      <a:fillRect/>
+                    </a:stretch>
+                  </pic:blipFill>
+                  <pic:spPr bwMode="auto">
+                    <a:xfrm>
+                      <a:off x="0" y="0"/>
+                      <a:ext cx="5943600" cy="5438775"/>
+                    </a:xfrm>
+                    <a:prstGeom prst="rect">
+                      <a:avLst/>
+                    </a:prstGeom>
+                  </pic:spPr>
+                </pic:pic>
+              </a:graphicData>
+            </a:graphic>
+          </wp:inline>
+        </w:drawing>
+      </w:r>
+    </w:p>
+    <w:p>
+      <w:pPr>
+        <w:spacing w:after="240"/>
+        <w:jc w:val="center"/>
+      </w:pPr>
+      <w:r>
+        <w:rPr>
+          <w:i/>
+          <w:iCs/>
+          <w:color w:val="5B6675"/>
+          <w:sz w:val="17"/>
+          <w:szCs w:val="17"/>
+        </w:rPr>
+        <w:t xml:space="preserve">Figura 8. Arquitectura de software.</w:t>
+      </w:r>
+    </w:p>
+    <w:p>
+      <w:pPr>
+        <w:pStyle w:val="Heading2"/>
+        <w:spacing w:after="150" w:before="300"/>
+      </w:pPr>
+      <w:r>
+        <w:rPr>
+          <w:b/>
+          <w:bCs/>
+          <w:color w:val="1F3864"/>
+          <w:sz w:val="25"/>
+          <w:szCs w:val="25"/>
+        </w:rPr>
+        <w:t xml:space="preserve">11.5 Secuencia · detección y registro</w:t>
+      </w:r>
+    </w:p>
+    <w:p>
+      <w:pPr>
+        <w:spacing w:after="90" w:before="200"/>
+        <w:jc w:val="center"/>
+      </w:pPr>
+      <w:r>
+        <w:drawing>
+          <wp:inline distT="0" distB="0" distL="0" distR="0">
+            <wp:extent cx="2771775" cy="7239000"/>
+            <wp:effectExtent t="0" r="0" b="0" l="0"/>
+            <wp:docPr id="1" name="" descr="" title=""/>
+            <wp:cNvGraphicFramePr>
+              <a:graphicFrameLocks xmlns:a="http://schemas.openxmlformats.org/drawingml/2006/main" noChangeAspect="1"/>
+            </wp:cNvGraphicFramePr>
+            <a:graphic xmlns:a="http://schemas.openxmlformats.org/drawingml/2006/main">
+              <a:graphicData uri="http://schemas.openxmlformats.org/drawingml/2006/picture">
+                <pic:pic xmlns:pic="http://schemas.openxmlformats.org/drawingml/2006/picture">
+                  <pic:nvPicPr>
+                    <pic:cNvPr id="0" name="" descr=""/>
+                    <pic:cNvPicPr>
+                      <a:picLocks noChangeAspect="1" noChangeArrowheads="1"/>
+                    </pic:cNvPicPr>
+                  </pic:nvPicPr>
+                  <pic:blipFill>
+                    <a:blip r:embed="rId16" cstate="none"/>
+                    <a:srcRect/>
+                    <a:stretch>
+                      <a:fillRect/>
+                    </a:stretch>
+                  </pic:blipFill>
+                  <pic:spPr bwMode="auto">
+                    <a:xfrm>
+                      <a:off x="0" y="0"/>
                       <a:ext cx="2771775" cy="7239000"/>
                     </a:xfrm>
                     <a:prstGeom prst="rect">
@@ -54192,7 +54435,7 @@
                     </pic:cNvPicPr>
                   </pic:nvPicPr>
                   <pic:blipFill>
-                    <a:blip r:embed="rId12" cstate="none"/>
+                    <a:blip r:embed="rId17" cstate="none"/>
                     <a:srcRect/>
                     <a:stretch>
                       <a:fillRect/>

</xml_diff>

<commit_message>
@ Se corrigen dos reglas con texto duplicado y se completa la tira de identificadores
RN-REC-002 y RN-IA-002 llevaban en el cuerpo de la regla el texto de
RN-REC-001 y RN-IA-001 respectivamente. Sus condiciones de aplicacion y
sus criterios de aceptacion ya eran los correctos; solo se reemplaza la
descripcion estructurada.

La tira de la seccion 1.1 declaraba cinco formatos de identificador, pero
la seccion 10 usa dos mas: TC-nn (64 veces) y PNF-nn (23 veces). Se
agregan ambos y se distingue en el texto entre los identificadores del
modelo de requisitos y los de su comprobacion.
@
</commit_message>
<xml_diff>
--- a/docs/Modelado de requisitos - Ojo al Gasto.docx
+++ b/docs/Modelado de requisitos - Ojo al Gasto.docx
@@ -287,7 +287,7 @@
           <w:sz w:val="20"/>
           <w:szCs w:val="20"/>
         </w:rPr>
-        <w:t xml:space="preserve">Cada elemento se presenta como una ficha, con su identificador, sus atributos en una tira superior y sus contenidos extensos debajo. Los identificadores siguen un formato único:</w:t>
+        <w:t xml:space="preserve">Cada elemento se presenta como una ficha, con su identificador, sus atributos en una tira superior y sus contenidos extensos debajo. Los identificadores siguen un formato único. Los cinco primeros nombran elementos del modelo de requisitos; los dos últimos, su comprobación en la sección 10:</w:t>
       </w:r>
     </w:p>
     <w:tbl>
@@ -303,16 +303,18 @@
         </w:tblBorders>
       </w:tblPr>
       <w:tblGrid>
-        <w:gridCol w:w="1872"/>
-        <w:gridCol w:w="1872"/>
-        <w:gridCol w:w="1872"/>
-        <w:gridCol w:w="1872"/>
-        <w:gridCol w:w="1872"/>
+        <w:gridCol w:w="1337"/>
+        <w:gridCol w:w="1337"/>
+        <w:gridCol w:w="1337"/>
+        <w:gridCol w:w="1337"/>
+        <w:gridCol w:w="1337"/>
+        <w:gridCol w:w="1337"/>
+        <w:gridCol w:w="1337"/>
       </w:tblGrid>
       <w:tr>
         <w:tc>
           <w:tcPr>
-            <w:tcW w:type="dxa" w:w="1872"/>
+            <w:tcW w:type="dxa" w:w="1337"/>
             <w:shd w:fill="F4F7FB" w:color="auto" w:val="clear"/>
             <w:tcMar>
               <w:top w:type="dxa" w:w="60"/>
@@ -352,7 +354,7 @@
         </w:tc>
         <w:tc>
           <w:tcPr>
-            <w:tcW w:type="dxa" w:w="1872"/>
+            <w:tcW w:type="dxa" w:w="1337"/>
             <w:shd w:fill="F4F7FB" w:color="auto" w:val="clear"/>
             <w:tcMar>
               <w:top w:type="dxa" w:w="60"/>
@@ -392,7 +394,7 @@
         </w:tc>
         <w:tc>
           <w:tcPr>
-            <w:tcW w:type="dxa" w:w="1872"/>
+            <w:tcW w:type="dxa" w:w="1337"/>
             <w:shd w:fill="F4F7FB" w:color="auto" w:val="clear"/>
             <w:tcMar>
               <w:top w:type="dxa" w:w="60"/>
@@ -432,7 +434,7 @@
         </w:tc>
         <w:tc>
           <w:tcPr>
-            <w:tcW w:type="dxa" w:w="1872"/>
+            <w:tcW w:type="dxa" w:w="1337"/>
             <w:shd w:fill="F4F7FB" w:color="auto" w:val="clear"/>
             <w:tcMar>
               <w:top w:type="dxa" w:w="60"/>
@@ -472,7 +474,7 @@
         </w:tc>
         <w:tc>
           <w:tcPr>
-            <w:tcW w:type="dxa" w:w="1872"/>
+            <w:tcW w:type="dxa" w:w="1337"/>
             <w:shd w:fill="F4F7FB" w:color="auto" w:val="clear"/>
             <w:tcMar>
               <w:top w:type="dxa" w:w="60"/>
@@ -507,6 +509,86 @@
                 <w:szCs w:val="18"/>
               </w:rPr>
               <w:t xml:space="preserve">Caso de uso</w:t>
+            </w:r>
+          </w:p>
+        </w:tc>
+        <w:tc>
+          <w:tcPr>
+            <w:tcW w:type="dxa" w:w="1337"/>
+            <w:shd w:fill="F4F7FB" w:color="auto" w:val="clear"/>
+            <w:tcMar>
+              <w:top w:type="dxa" w:w="60"/>
+              <w:left w:type="dxa" w:w="110"/>
+              <w:bottom w:type="dxa" w:w="60"/>
+              <w:right w:type="dxa" w:w="110"/>
+            </w:tcMar>
+          </w:tcPr>
+          <w:p>
+            <w:pPr>
+              <w:spacing w:after="20"/>
+            </w:pPr>
+            <w:r>
+              <w:rPr>
+                <w:b/>
+                <w:bCs/>
+                <w:caps/>
+                <w:color w:val="5B6675"/>
+                <w:sz w:val="15"/>
+                <w:szCs w:val="15"/>
+              </w:rPr>
+              <w:t xml:space="preserve">TC-nn</w:t>
+            </w:r>
+          </w:p>
+          <w:p>
+            <w:pPr>
+              <w:spacing w:after="0"/>
+            </w:pPr>
+            <w:r>
+              <w:rPr>
+                <w:sz w:val="18"/>
+                <w:szCs w:val="18"/>
+              </w:rPr>
+              <w:t xml:space="preserve">Caso de prueba</w:t>
+            </w:r>
+          </w:p>
+        </w:tc>
+        <w:tc>
+          <w:tcPr>
+            <w:tcW w:type="dxa" w:w="1337"/>
+            <w:shd w:fill="F4F7FB" w:color="auto" w:val="clear"/>
+            <w:tcMar>
+              <w:top w:type="dxa" w:w="60"/>
+              <w:left w:type="dxa" w:w="110"/>
+              <w:bottom w:type="dxa" w:w="60"/>
+              <w:right w:type="dxa" w:w="110"/>
+            </w:tcMar>
+          </w:tcPr>
+          <w:p>
+            <w:pPr>
+              <w:spacing w:after="20"/>
+            </w:pPr>
+            <w:r>
+              <w:rPr>
+                <w:b/>
+                <w:bCs/>
+                <w:caps/>
+                <w:color w:val="5B6675"/>
+                <w:sz w:val="15"/>
+                <w:szCs w:val="15"/>
+              </w:rPr>
+              <w:t xml:space="preserve">PNF-nn</w:t>
+            </w:r>
+          </w:p>
+          <w:p>
+            <w:pPr>
+              <w:spacing w:after="0"/>
+            </w:pPr>
+            <w:r>
+              <w:rPr>
+                <w:sz w:val="18"/>
+                <w:szCs w:val="18"/>
+              </w:rPr>
+              <w:t xml:space="preserve">Prueba no funcional</w:t>
             </w:r>
           </w:p>
         </w:tc>
@@ -6864,7 +6946,7 @@
           <w:sz w:val="20"/>
           <w:szCs w:val="20"/>
         </w:rPr>
-        <w:t xml:space="preserve">El sistema solo generará una recomendación de cambio de plan o contratación de combo cuando el ahorro estimado sea igual o superior al 15% del costo mensual equivalente y exista información de precios válida y vigente.</w:t>
+        <w:t xml:space="preserve">El sistema etiquetará como posible bajo uso toda suscripción activa que acumule 45 días consecutivos sin interacción registrada. La etiqueta es informativa: señala la suscripción como candidata a revisión y no la cancela ni la modifica por sí sola.</w:t>
       </w:r>
     </w:p>
     <w:p>
@@ -8777,7 +8859,7 @@
           <w:sz w:val="20"/>
           <w:szCs w:val="20"/>
         </w:rPr>
-        <w:t xml:space="preserve">Antes de enviar información a un proveedor externo de IA, el sistema debe eliminar o enmascarar los datos personales y financieros definidos en la política de privacidad. Si no puede determinar con suficiente confianza que el contenido fue sanitizado, debe bloquear el envío y mostrar un mensaje al usuario.</w:t>
+        <w:t xml:space="preserve">Si la llamada al proveedor externo de IA excede el tiempo de espera definido, el sistema debe informar al usuario la limitación y ofrecer una alternativa útil. En ningún caso se presentará un resultado parcial o generado localmente como si fuera respuesta de la IA.</w:t>
       </w:r>
     </w:p>
     <w:p>

</xml_diff>

<commit_message>
Se corrige la asignacion de figuras de la seccion 11
Las figuras del modelado UML estaban asociadas al titulo equivocado:

- 11.2 "Modelo entidad-relacion" mostraba un diagrama de casos de uso
  anterior, no el MER.
- 11.3 "Diagrama de flujo" mostraba el MER.
- El diagrama de flujo real no aparecia en el documento.

Ahora 11.2 lleva el MER y 11.3 el diagrama de flujo.

Se retira ademas el diagrama de casos de uso anterior. No solo estaba mal
rotulado: contradice los cinco de la seccion 11.1, que usan la numeracion
vigente, e incluye casos que ya no existen en el modelo. Siguen siendo
diez figuras.
</commit_message>
<xml_diff>
--- a/docs/Modelado de requisitos - Ojo al Gasto.docx
+++ b/docs/Modelado de requisitos - Ojo al Gasto.docx
@@ -54189,7 +54189,7 @@
       <w:r>
         <w:drawing>
           <wp:inline distT="0" distB="0" distL="0" distR="0">
-            <wp:extent cx="4238625" cy="7239000"/>
+            <wp:extent cx="2724150" cy="7239000"/>
             <wp:effectExtent t="0" r="0" b="0" l="0"/>
             <wp:docPr id="1" name="" descr="" title=""/>
             <wp:cNvGraphicFramePr>
@@ -54214,7 +54214,7 @@
                   <pic:spPr bwMode="auto">
                     <a:xfrm>
                       <a:off x="0" y="0"/>
-                      <a:ext cx="4238625" cy="7239000"/>
+                      <a:ext cx="2724150" cy="7239000"/>
                     </a:xfrm>
                     <a:prstGeom prst="rect">
                       <a:avLst/>
@@ -54267,7 +54267,7 @@
       <w:r>
         <w:drawing>
           <wp:inline distT="0" distB="0" distL="0" distR="0">
-            <wp:extent cx="2724150" cy="7239000"/>
+            <wp:extent cx="5943600" cy="3848100"/>
             <wp:effectExtent t="0" r="0" b="0" l="0"/>
             <wp:docPr id="1" name="" descr="" title=""/>
             <wp:cNvGraphicFramePr>
@@ -54292,7 +54292,7 @@
                   <pic:spPr bwMode="auto">
                     <a:xfrm>
                       <a:off x="0" y="0"/>
-                      <a:ext cx="2724150" cy="7239000"/>
+                      <a:ext cx="5943600" cy="3848100"/>
                     </a:xfrm>
                     <a:prstGeom prst="rect">
                       <a:avLst/>

</xml_diff>